<commit_message>
Expand README explanations and Wireshark guide
</commit_message>
<xml_diff>
--- a/README.docx
+++ b/README.docx
@@ -660,6 +660,32 @@
           <w:sz w:val="21"/>
         </w:rPr>
         <w:t>README.md: GitHub 및 제출용 설명 문서</w:t>
+      </w:r>
+    </w:p>
+    <w:p>
+      <w:pPr>
+        <w:spacing w:after="100" w:line="276" w:lineRule="auto"/>
+      </w:pPr>
+      <w:r>
+        <w:rPr>
+          <w:rFonts w:ascii="AppleGothic" w:hAnsi="AppleGothic" w:eastAsia="AppleGothic"/>
+          <w:b w:val="0"/>
+          <w:sz w:val="21"/>
+        </w:rPr>
+        <w:t>README.docx / README.pdf: 과제 제출용 10장 이상 상세 보고서</w:t>
+      </w:r>
+    </w:p>
+    <w:p>
+      <w:pPr>
+        <w:spacing w:after="100" w:line="276" w:lineRule="auto"/>
+      </w:pPr>
+      <w:r>
+        <w:rPr>
+          <w:rFonts w:ascii="AppleGothic" w:hAnsi="AppleGothic" w:eastAsia="AppleGothic"/>
+          <w:b w:val="0"/>
+          <w:sz w:val="21"/>
+        </w:rPr>
+        <w:t>WireShark/: 본인 PC에서 직접 캡처한 Wireshark PNG를 저장할 폴더</w:t>
       </w:r>
     </w:p>
     <w:p>
@@ -1937,6 +1963,123 @@
       </w:r>
     </w:p>
     <w:p>
+      <w:pPr>
+        <w:spacing w:after="100" w:line="276" w:lineRule="auto"/>
+      </w:pPr>
+      <w:r>
+        <w:rPr>
+          <w:rFonts w:ascii="AppleGothic" w:hAnsi="AppleGothic" w:eastAsia="AppleGothic"/>
+          <w:b w:val="0"/>
+          <w:sz w:val="21"/>
+        </w:rPr>
+        <w:t>make_http_date(): Response Header의 Date 값을 GMT 형식으로 생성한다.</w:t>
+      </w:r>
+    </w:p>
+    <w:p>
+      <w:pPr>
+        <w:spacing w:after="100" w:line="276" w:lineRule="auto"/>
+      </w:pPr>
+      <w:r>
+        <w:rPr>
+          <w:rFonts w:ascii="AppleGothic" w:hAnsi="AppleGothic" w:eastAsia="AppleGothic"/>
+          <w:b w:val="0"/>
+          <w:sz w:val="21"/>
+        </w:rPr>
+        <w:t>guess_content_type(): .html 요청은 text/html, .txt 요청은 text/plain으로 Content-Type을 지정한다.</w:t>
+      </w:r>
+    </w:p>
+    <w:p>
+      <w:pPr>
+        <w:spacing w:after="100" w:line="276" w:lineRule="auto"/>
+      </w:pPr>
+      <w:r>
+        <w:rPr>
+          <w:rFonts w:ascii="AppleGothic" w:hAnsi="AppleGothic" w:eastAsia="AppleGothic"/>
+          <w:b w:val="0"/>
+          <w:sz w:val="21"/>
+        </w:rPr>
+        <w:t>handle_get(): 파일이 존재하면 200 OK와 파일 내용을 응답하고, 없으면 404 Not Found를 응답한다.</w:t>
+      </w:r>
+    </w:p>
+    <w:p>
+      <w:pPr>
+        <w:spacing w:after="100" w:line="276" w:lineRule="auto"/>
+      </w:pPr>
+      <w:r>
+        <w:rPr>
+          <w:rFonts w:ascii="AppleGothic" w:hAnsi="AppleGothic" w:eastAsia="AppleGothic"/>
+          <w:b w:val="0"/>
+          <w:sz w:val="21"/>
+        </w:rPr>
+        <w:t>handle_head(): GET과 같은 상태 판단을 하되 Body 없이 Header만 응답한다.</w:t>
+      </w:r>
+    </w:p>
+    <w:p>
+      <w:pPr>
+        <w:spacing w:after="100" w:line="276" w:lineRule="auto"/>
+      </w:pPr>
+      <w:r>
+        <w:rPr>
+          <w:rFonts w:ascii="AppleGothic" w:hAnsi="AppleGothic" w:eastAsia="AppleGothic"/>
+          <w:b w:val="0"/>
+          <w:sz w:val="21"/>
+        </w:rPr>
+        <w:t>handle_post(): /post.txt가 없으면 생성 후 201 Created, 있으면 append 후 200 OK를 응답한다.</w:t>
+      </w:r>
+    </w:p>
+    <w:p>
+      <w:pPr>
+        <w:spacing w:after="100" w:line="276" w:lineRule="auto"/>
+      </w:pPr>
+      <w:r>
+        <w:rPr>
+          <w:rFonts w:ascii="AppleGothic" w:hAnsi="AppleGothic" w:eastAsia="AppleGothic"/>
+          <w:b w:val="0"/>
+          <w:sz w:val="21"/>
+        </w:rPr>
+        <w:t>handle_put(): /put.txt를 Body 내용으로 덮어쓰고 204 No Content를 응답한다. /readonly.txt는 403 Forbidden으로 거부한다.</w:t>
+      </w:r>
+    </w:p>
+    <w:p>
+      <w:pPr>
+        <w:spacing w:after="100" w:line="276" w:lineRule="auto"/>
+      </w:pPr>
+      <w:r>
+        <w:rPr>
+          <w:rFonts w:ascii="AppleGothic" w:hAnsi="AppleGothic" w:eastAsia="AppleGothic"/>
+          <w:b w:val="0"/>
+          <w:sz w:val="21"/>
+        </w:rPr>
+        <w:t>handle_delete(): /post.txt 또는 /put.txt를 삭제하고 200 OK를 응답한다. 삭제 금지 대상은 403 Forbidden으로 처리한다.</w:t>
+      </w:r>
+    </w:p>
+    <w:p>
+      <w:pPr>
+        <w:spacing w:after="100" w:line="276" w:lineRule="auto"/>
+      </w:pPr>
+      <w:r>
+        <w:rPr>
+          <w:rFonts w:ascii="AppleGothic" w:hAnsi="AppleGothic" w:eastAsia="AppleGothic"/>
+          <w:b w:val="0"/>
+          <w:sz w:val="21"/>
+        </w:rPr>
+        <w:t>Server 터미널에는 Client 주소, 원본 Request, Parsed method/path/version, Header count, Body length, Response status가 출력된다.</w:t>
+      </w:r>
+    </w:p>
+    <w:p>
+      <w:pPr>
+        <w:spacing w:after="100" w:line="276" w:lineRule="auto"/>
+      </w:pPr>
+      <w:r>
+        <w:rPr>
+          <w:rFonts w:ascii="AppleGothic" w:hAnsi="AppleGothic" w:eastAsia="AppleGothic"/>
+          <w:b w:val="0"/>
+          <w:sz w:val="21"/>
+        </w:rPr>
+        <w:t>영상 설명에서는 Server가 단순 문자열 출력 프로그램이 아니라 Request 파싱, 파일 제어, HTTP Response 생성을 수행한다는 점을 강조한다.</w:t>
+      </w:r>
+    </w:p>
+    <w:p>
       <w:r>
         <w:br w:type="page"/>
       </w:r>
@@ -2005,6 +2148,71 @@
           <w:sz w:val="21"/>
         </w:rPr>
         <w:t>Client 터미널에는 보낸 Request와 받은 Response가 모두 출력되므로 영상 시연에서 HTTP 메시지 확인이 쉽다.</w:t>
+      </w:r>
+    </w:p>
+    <w:p>
+      <w:pPr>
+        <w:spacing w:after="100" w:line="276" w:lineRule="auto"/>
+      </w:pPr>
+      <w:r>
+        <w:rPr>
+          <w:rFonts w:ascii="AppleGothic" w:hAnsi="AppleGothic" w:eastAsia="AppleGothic"/>
+          <w:b w:val="0"/>
+          <w:sz w:val="21"/>
+        </w:rPr>
+        <w:t>사용자가 입력한 Method와 Path는 Request Line으로 변환된다. 예: GET /index.html HTTP/1.1</w:t>
+      </w:r>
+    </w:p>
+    <w:p>
+      <w:pPr>
+        <w:spacing w:after="100" w:line="276" w:lineRule="auto"/>
+      </w:pPr>
+      <w:r>
+        <w:rPr>
+          <w:rFonts w:ascii="AppleGothic" w:hAnsi="AppleGothic" w:eastAsia="AppleGothic"/>
+          <w:b w:val="0"/>
+          <w:sz w:val="21"/>
+        </w:rPr>
+        <w:t>POST와 PUT은 Body 입력을 추가로 받고, Body의 UTF-8 byte 길이를 계산하여 Content-Length에 넣는다.</w:t>
+      </w:r>
+    </w:p>
+    <w:p>
+      <w:pPr>
+        <w:spacing w:after="100" w:line="276" w:lineRule="auto"/>
+      </w:pPr>
+      <w:r>
+        <w:rPr>
+          <w:rFonts w:ascii="AppleGothic" w:hAnsi="AppleGothic" w:eastAsia="AppleGothic"/>
+          <w:b w:val="0"/>
+          <w:sz w:val="21"/>
+        </w:rPr>
+        <w:t>Client는 socket.AF_INET, socket.SOCK_STREAM으로 TCP 소켓을 만들고 127.0.0.1:8080에 connect한다.</w:t>
+      </w:r>
+    </w:p>
+    <w:p>
+      <w:pPr>
+        <w:spacing w:after="100" w:line="276" w:lineRule="auto"/>
+      </w:pPr>
+      <w:r>
+        <w:rPr>
+          <w:rFonts w:ascii="AppleGothic" w:hAnsi="AppleGothic" w:eastAsia="AppleGothic"/>
+          <w:b w:val="0"/>
+          <w:sz w:val="21"/>
+        </w:rPr>
+        <w:t>sendall()로 Request 전체를 전송하고, recv()를 반복하여 Server가 보낸 Response를 끝까지 수신한다.</w:t>
+      </w:r>
+    </w:p>
+    <w:p>
+      <w:pPr>
+        <w:spacing w:after="100" w:line="276" w:lineRule="auto"/>
+      </w:pPr>
+      <w:r>
+        <w:rPr>
+          <w:rFonts w:ascii="AppleGothic" w:hAnsi="AppleGothic" w:eastAsia="AppleGothic"/>
+          <w:b w:val="0"/>
+          <w:sz w:val="21"/>
+        </w:rPr>
+        <w:t>영상 설명에서는 Client 출력의 Sent Request와 Received Response가 Wireshark 패킷의 HTTP 내용과 일치한다는 점을 보여준다.</w:t>
       </w:r>
     </w:p>
     <w:p>
@@ -2355,6 +2563,123 @@
     </w:p>
     <w:p>
       <w:pPr>
+        <w:spacing w:after="100" w:line="276" w:lineRule="auto"/>
+      </w:pPr>
+      <w:r>
+        <w:rPr>
+          <w:rFonts w:ascii="AppleGothic" w:hAnsi="AppleGothic" w:eastAsia="AppleGothic"/>
+          <w:b w:val="0"/>
+          <w:sz w:val="21"/>
+        </w:rPr>
+        <w:t>GitHub에는 선배 예시처럼 WireShark 폴더를 만들고, 직접 캡처한 PNG 이미지를 저장한다.</w:t>
+      </w:r>
+    </w:p>
+    <w:p>
+      <w:pPr>
+        <w:spacing w:after="100" w:line="276" w:lineRule="auto"/>
+      </w:pPr>
+      <w:r>
+        <w:rPr>
+          <w:rFonts w:ascii="AppleGothic" w:hAnsi="AppleGothic" w:eastAsia="AppleGothic"/>
+          <w:b w:val="0"/>
+          <w:sz w:val="21"/>
+        </w:rPr>
+        <w:t>GET_OK.png: GET /index.html 요청과 HTTP/1.1 200 OK 응답을 캡처한다.</w:t>
+      </w:r>
+    </w:p>
+    <w:p>
+      <w:pPr>
+        <w:spacing w:after="100" w:line="276" w:lineRule="auto"/>
+      </w:pPr>
+      <w:r>
+        <w:rPr>
+          <w:rFonts w:ascii="AppleGothic" w:hAnsi="AppleGothic" w:eastAsia="AppleGothic"/>
+          <w:b w:val="0"/>
+          <w:sz w:val="21"/>
+        </w:rPr>
+        <w:t>GET_NO.png: GET /notfound.html 요청과 HTTP/1.1 404 Not Found 응답을 캡처한다.</w:t>
+      </w:r>
+    </w:p>
+    <w:p>
+      <w:pPr>
+        <w:spacing w:after="100" w:line="276" w:lineRule="auto"/>
+      </w:pPr>
+      <w:r>
+        <w:rPr>
+          <w:rFonts w:ascii="AppleGothic" w:hAnsi="AppleGothic" w:eastAsia="AppleGothic"/>
+          <w:b w:val="0"/>
+          <w:sz w:val="21"/>
+        </w:rPr>
+        <w:t>HEAD_OK.png: HEAD /index.html 요청과 HTTP/1.1 200 OK 응답을 캡처한다.</w:t>
+      </w:r>
+    </w:p>
+    <w:p>
+      <w:pPr>
+        <w:spacing w:after="100" w:line="276" w:lineRule="auto"/>
+      </w:pPr>
+      <w:r>
+        <w:rPr>
+          <w:rFonts w:ascii="AppleGothic" w:hAnsi="AppleGothic" w:eastAsia="AppleGothic"/>
+          <w:b w:val="0"/>
+          <w:sz w:val="21"/>
+        </w:rPr>
+        <w:t>POST_1_CREATED.png: 첫 번째 POST /post.txt 요청과 HTTP/1.1 201 Created 응답을 캡처한다.</w:t>
+      </w:r>
+    </w:p>
+    <w:p>
+      <w:pPr>
+        <w:spacing w:after="100" w:line="276" w:lineRule="auto"/>
+      </w:pPr>
+      <w:r>
+        <w:rPr>
+          <w:rFonts w:ascii="AppleGothic" w:hAnsi="AppleGothic" w:eastAsia="AppleGothic"/>
+          <w:b w:val="0"/>
+          <w:sz w:val="21"/>
+        </w:rPr>
+        <w:t>POST_2_OK.png: 두 번째 POST /post.txt 요청과 HTTP/1.1 200 OK 응답을 캡처한다.</w:t>
+      </w:r>
+    </w:p>
+    <w:p>
+      <w:pPr>
+        <w:spacing w:after="100" w:line="276" w:lineRule="auto"/>
+      </w:pPr>
+      <w:r>
+        <w:rPr>
+          <w:rFonts w:ascii="AppleGothic" w:hAnsi="AppleGothic" w:eastAsia="AppleGothic"/>
+          <w:b w:val="0"/>
+          <w:sz w:val="21"/>
+        </w:rPr>
+        <w:t>PUT_OK.png: PUT /put.txt 요청과 HTTP/1.1 204 No Content 응답을 캡처한다.</w:t>
+      </w:r>
+    </w:p>
+    <w:p>
+      <w:pPr>
+        <w:spacing w:after="100" w:line="276" w:lineRule="auto"/>
+      </w:pPr>
+      <w:r>
+        <w:rPr>
+          <w:rFonts w:ascii="AppleGothic" w:hAnsi="AppleGothic" w:eastAsia="AppleGothic"/>
+          <w:b w:val="0"/>
+          <w:sz w:val="21"/>
+        </w:rPr>
+        <w:t>DELETE_OK.png: DELETE /post.txt 요청과 HTTP/1.1 200 OK 응답을 캡처한다.</w:t>
+      </w:r>
+    </w:p>
+    <w:p>
+      <w:pPr>
+        <w:spacing w:after="100" w:line="276" w:lineRule="auto"/>
+      </w:pPr>
+      <w:r>
+        <w:rPr>
+          <w:rFonts w:ascii="AppleGothic" w:hAnsi="AppleGothic" w:eastAsia="AppleGothic"/>
+          <w:b w:val="0"/>
+          <w:sz w:val="21"/>
+        </w:rPr>
+        <w:t>BAD_REQUEST.png: PATCH /index.html 요청과 HTTP/1.1 400 Bad Request 응답을 캡처한다.</w:t>
+      </w:r>
+    </w:p>
+    <w:p>
+      <w:pPr>
         <w:spacing w:before="160" w:after="120"/>
       </w:pPr>
       <w:r>
@@ -2443,6 +2768,45 @@
           <w:sz w:val="21"/>
         </w:rPr>
         <w:t>5분이 부족하면 server.py의 함수별 역할과 HTTP 메시지 구조를 설명한다.</w:t>
+      </w:r>
+    </w:p>
+    <w:p>
+      <w:pPr>
+        <w:spacing w:after="100" w:line="276" w:lineRule="auto"/>
+      </w:pPr>
+      <w:r>
+        <w:rPr>
+          <w:rFonts w:ascii="AppleGothic" w:hAnsi="AppleGothic" w:eastAsia="AppleGothic"/>
+          <w:b w:val="0"/>
+          <w:sz w:val="21"/>
+        </w:rPr>
+        <w:t>PUT /put.txt는 204 No Content라 Body가 안 나오는 것이 정상이다. 바로 이어서 GET /put.txt로 변경된 파일 내용을 확인한다.</w:t>
+      </w:r>
+    </w:p>
+    <w:p>
+      <w:pPr>
+        <w:spacing w:after="100" w:line="276" w:lineRule="auto"/>
+      </w:pPr>
+      <w:r>
+        <w:rPr>
+          <w:rFonts w:ascii="AppleGothic" w:hAnsi="AppleGothic" w:eastAsia="AppleGothic"/>
+          <w:b w:val="0"/>
+          <w:sz w:val="21"/>
+        </w:rPr>
+        <w:t>POST /post.txt는 첫 번째 실행에서 파일 생성, 두 번째 실행에서 append가 되는 것을 GET /post.txt로 확인한다.</w:t>
+      </w:r>
+    </w:p>
+    <w:p>
+      <w:pPr>
+        <w:spacing w:after="100" w:line="276" w:lineRule="auto"/>
+      </w:pPr>
+      <w:r>
+        <w:rPr>
+          <w:rFonts w:ascii="AppleGothic" w:hAnsi="AppleGothic" w:eastAsia="AppleGothic"/>
+          <w:b w:val="0"/>
+          <w:sz w:val="21"/>
+        </w:rPr>
+        <w:t>Wireshark 캡처 화면에서는 상단 필터, Protocol HTTP, Info 열의 Method/Status, 하단 상세 영역의 Request Line 또는 Status Line이 보이게 한다.</w:t>
       </w:r>
     </w:p>
     <w:p>

</xml_diff>

<commit_message>
Align report with submission results format
</commit_message>
<xml_diff>
--- a/README.docx
+++ b/README.docx
@@ -278,7 +278,7 @@
           <w:b w:val="0"/>
           <w:sz w:val="21"/>
         </w:rPr>
-        <w:t>17. Wireshark 캡처 방법</w:t>
+        <w:t>17. Client / WireShark 실행 결과</w:t>
       </w:r>
     </w:p>
     <w:p>
@@ -291,7 +291,7 @@
           <w:b w:val="0"/>
           <w:sz w:val="21"/>
         </w:rPr>
-        <w:t>18. 영상 녹화 시나리오</w:t>
+        <w:t>18. Server 실행 결과</w:t>
       </w:r>
     </w:p>
     <w:p>
@@ -304,7 +304,7 @@
           <w:b w:val="0"/>
           <w:sz w:val="21"/>
         </w:rPr>
-        <w:t>19. 문제 해결 및 주의 사항</w:t>
+        <w:t>19. 제출 파일 및 캡처 파일 구성</w:t>
       </w:r>
     </w:p>
     <w:p>
@@ -317,7 +317,7 @@
           <w:b w:val="0"/>
           <w:sz w:val="21"/>
         </w:rPr>
-        <w:t>20. 전체 결과 요약</w:t>
+        <w:t>20. 전체 실행 결과 요약</w:t>
       </w:r>
     </w:p>
     <w:p>
@@ -685,7 +685,20 @@
           <w:b w:val="0"/>
           <w:sz w:val="21"/>
         </w:rPr>
-        <w:t>WireShark/: 본인 PC에서 직접 캡처한 Wireshark PNG를 저장할 폴더</w:t>
+        <w:t>README/: 본인 PC에서 직접 캡처한 실행 결과 PNG를 저장할 폴더</w:t>
+      </w:r>
+    </w:p>
+    <w:p>
+      <w:pPr>
+        <w:spacing w:after="100" w:line="276" w:lineRule="auto"/>
+      </w:pPr>
+      <w:r>
+        <w:rPr>
+          <w:rFonts w:ascii="AppleGothic" w:hAnsi="AppleGothic" w:eastAsia="AppleGothic"/>
+          <w:b w:val="0"/>
+          <w:sz w:val="21"/>
+        </w:rPr>
+        <w:t>WireShark/: 본인 PC에서 직접 저장한 Wireshark pcapng 파일을 저장할 폴더</w:t>
       </w:r>
     </w:p>
     <w:p>
@@ -2506,7 +2519,7 @@
           <w:color w:val="1F4E79"/>
           <w:sz w:val="30"/>
         </w:rPr>
-        <w:t>17. Wireshark 캡처 방법</w:t>
+        <w:t>17. Client / WireShark 실행 결과</w:t>
       </w:r>
     </w:p>
     <w:p>
@@ -2519,7 +2532,7 @@
           <w:b w:val="0"/>
           <w:sz w:val="21"/>
         </w:rPr>
-        <w:t>macOS에서 localhost 통신을 캡처하려면 Wireshark에서 lo0 인터페이스를 선택한다.</w:t>
+        <w:t>GET /index.html 실행 결과, Client는 HTTP/1.1 형식의 GET Request를 전송하고 Server는 index.html 파일 내용을 포함하여 200 OK로 응답한다. README/GET_OK.png에는 Client 결과 또는 Wireshark HTTP 패킷 화면을 첨부한다.</w:t>
       </w:r>
     </w:p>
     <w:p>
@@ -2532,7 +2545,7 @@
           <w:b w:val="0"/>
           <w:sz w:val="21"/>
         </w:rPr>
-        <w:t>Display Filter는 tcp.port == 8080을 사용한다.</w:t>
+        <w:t>GET /notfound.html 실행 결과, 존재하지 않는 파일 요청에 대해 Server는 404 Not Found를 응답한다. README/GET_NO.png에는 404 응답 화면을 첨부한다.</w:t>
       </w:r>
     </w:p>
     <w:p>
@@ -2545,7 +2558,7 @@
           <w:b w:val="0"/>
           <w:sz w:val="21"/>
         </w:rPr>
-        <w:t>HTTP로 자동 해석되지 않으면 Decode As에서 TCP port 8080을 HTTP로 지정한다.</w:t>
+        <w:t>HEAD /index.html 실행 결과, Server는 200 OK Header를 보내지만 Body를 전송하지 않는다. README/HEAD.png에는 Header 중심 응답 화면을 첨부한다.</w:t>
       </w:r>
     </w:p>
     <w:p>
@@ -2558,7 +2571,7 @@
           <w:b w:val="0"/>
           <w:sz w:val="21"/>
         </w:rPr>
-        <w:t>GET, POST, PUT, DELETE 패킷에서 Request Line, Header, Body, Response Status Line을 확인한다.</w:t>
+        <w:t>POST /post.txt 첫 번째 실행 결과, Server는 post.txt 파일을 생성하고 201 Created를 응답한다. README/POST_1.png에는 Request Body와 201 응답 화면을 첨부한다.</w:t>
       </w:r>
     </w:p>
     <w:p>
@@ -2571,7 +2584,7 @@
           <w:b w:val="0"/>
           <w:sz w:val="21"/>
         </w:rPr>
-        <w:t>GitHub에는 선배 예시처럼 WireShark 폴더를 만들고, 직접 캡처한 PNG 이미지를 저장한다.</w:t>
+        <w:t>POST /post.txt 두 번째 실행 결과, Server는 기존 post.txt 뒤에 Body를 append하고 200 OK를 응답한다. README/POST_2.png에는 append 응답 화면을 첨부한다.</w:t>
       </w:r>
     </w:p>
     <w:p>
@@ -2584,7 +2597,7 @@
           <w:b w:val="0"/>
           <w:sz w:val="21"/>
         </w:rPr>
-        <w:t>GET_OK.png: GET /index.html 요청과 HTTP/1.1 200 OK 응답을 캡처한다.</w:t>
+        <w:t>PUT /put.txt 실행 결과, Server는 Body 내용으로 put.txt를 덮어쓰고 204 No Content를 응답한다. README/PUT_OK.png에는 204 응답과, 필요 시 GET /put.txt 확인 결과를 함께 첨부한다.</w:t>
       </w:r>
     </w:p>
     <w:p>
@@ -2597,7 +2610,7 @@
           <w:b w:val="0"/>
           <w:sz w:val="21"/>
         </w:rPr>
-        <w:t>GET_NO.png: GET /notfound.html 요청과 HTTP/1.1 404 Not Found 응답을 캡처한다.</w:t>
+        <w:t>DELETE /post.txt 실행 결과, Server는 생성된 파일을 삭제하고 200 OK를 응답한다. README/DELETE.png에는 DELETE 요청과 200 OK 응답 화면을 첨부한다.</w:t>
       </w:r>
     </w:p>
     <w:p>
@@ -2610,7 +2623,7 @@
           <w:b w:val="0"/>
           <w:sz w:val="21"/>
         </w:rPr>
-        <w:t>HEAD_OK.png: HEAD /index.html 요청과 HTTP/1.1 200 OK 응답을 캡처한다.</w:t>
+        <w:t>PATCH /index.html 실행 결과, 지원하지 않는 Method이므로 Server는 400 Bad Request를 응답한다. README/BAD_REQUEST.png에는 잘못된 Method 처리 결과를 첨부한다.</w:t>
       </w:r>
     </w:p>
     <w:p>
@@ -2623,59 +2636,7 @@
           <w:b w:val="0"/>
           <w:sz w:val="21"/>
         </w:rPr>
-        <w:t>POST_1_CREATED.png: 첫 번째 POST /post.txt 요청과 HTTP/1.1 201 Created 응답을 캡처한다.</w:t>
-      </w:r>
-    </w:p>
-    <w:p>
-      <w:pPr>
-        <w:spacing w:after="100" w:line="276" w:lineRule="auto"/>
-      </w:pPr>
-      <w:r>
-        <w:rPr>
-          <w:rFonts w:ascii="AppleGothic" w:hAnsi="AppleGothic" w:eastAsia="AppleGothic"/>
-          <w:b w:val="0"/>
-          <w:sz w:val="21"/>
-        </w:rPr>
-        <w:t>POST_2_OK.png: 두 번째 POST /post.txt 요청과 HTTP/1.1 200 OK 응답을 캡처한다.</w:t>
-      </w:r>
-    </w:p>
-    <w:p>
-      <w:pPr>
-        <w:spacing w:after="100" w:line="276" w:lineRule="auto"/>
-      </w:pPr>
-      <w:r>
-        <w:rPr>
-          <w:rFonts w:ascii="AppleGothic" w:hAnsi="AppleGothic" w:eastAsia="AppleGothic"/>
-          <w:b w:val="0"/>
-          <w:sz w:val="21"/>
-        </w:rPr>
-        <w:t>PUT_OK.png: PUT /put.txt 요청과 HTTP/1.1 204 No Content 응답을 캡처한다.</w:t>
-      </w:r>
-    </w:p>
-    <w:p>
-      <w:pPr>
-        <w:spacing w:after="100" w:line="276" w:lineRule="auto"/>
-      </w:pPr>
-      <w:r>
-        <w:rPr>
-          <w:rFonts w:ascii="AppleGothic" w:hAnsi="AppleGothic" w:eastAsia="AppleGothic"/>
-          <w:b w:val="0"/>
-          <w:sz w:val="21"/>
-        </w:rPr>
-        <w:t>DELETE_OK.png: DELETE /post.txt 요청과 HTTP/1.1 200 OK 응답을 캡처한다.</w:t>
-      </w:r>
-    </w:p>
-    <w:p>
-      <w:pPr>
-        <w:spacing w:after="100" w:line="276" w:lineRule="auto"/>
-      </w:pPr>
-      <w:r>
-        <w:rPr>
-          <w:rFonts w:ascii="AppleGothic" w:hAnsi="AppleGothic" w:eastAsia="AppleGothic"/>
-          <w:b w:val="0"/>
-          <w:sz w:val="21"/>
-        </w:rPr>
-        <w:t>BAD_REQUEST.png: PATCH /index.html 요청과 HTTP/1.1 400 Bad Request 응답을 캡처한다.</w:t>
+        <w:t>Wireshark 원본 캡처 파일은 WireShark/GET_OK.pcapng, WireShark/POST_1.pcapng, WireShark/PUT.pcapng, WireShark/DELETE.pcapng처럼 Method별로 저장한다.</w:t>
       </w:r>
     </w:p>
     <w:p>
@@ -2689,7 +2650,7 @@
           <w:color w:val="1F4E79"/>
           <w:sz w:val="30"/>
         </w:rPr>
-        <w:t>18. 영상 녹화 시나리오</w:t>
+        <w:t>18. Server 실행 결과</w:t>
       </w:r>
     </w:p>
     <w:p>
@@ -2702,7 +2663,7 @@
           <w:b w:val="0"/>
           <w:sz w:val="21"/>
         </w:rPr>
-        <w:t>영상 시작 시 노트북 또는 PC 화면의 날짜가 보이게 한다.</w:t>
+        <w:t>Server 실행 시 터미널에는 Listening 메시지가 출력되어 127.0.0.1:8080에서 Client 연결을 기다리는 상태임을 확인할 수 있다.</w:t>
       </w:r>
     </w:p>
     <w:p>
@@ -2715,7 +2676,7 @@
           <w:b w:val="0"/>
           <w:sz w:val="21"/>
         </w:rPr>
-        <w:t>프로젝트 폴더와 server.py, client.py, index.html, README 파일을 보여준다.</w:t>
+        <w:t>Client가 접속하면 Server는 Client 주소를 출력하고, 원본 Request 메시지를 그대로 출력한다.</w:t>
       </w:r>
     </w:p>
     <w:p>
@@ -2728,7 +2689,7 @@
           <w:b w:val="0"/>
           <w:sz w:val="21"/>
         </w:rPr>
-        <w:t>Server를 먼저 실행하고, Client로 GET, POST, POST, GET, PUT, GET, DELETE, PATCH 순서로 시연한다.</w:t>
+        <w:t>Server는 Request Line을 분석하여 Parsed method, Parsed path, Parsed version을 출력한다.</w:t>
       </w:r>
     </w:p>
     <w:p>
@@ -2741,7 +2702,7 @@
           <w:b w:val="0"/>
           <w:sz w:val="21"/>
         </w:rPr>
-        <w:t>각 요청마다 Client 출력과 Server 로그를 함께 보여준다.</w:t>
+        <w:t>POST와 PUT 요청에서는 Body length가 0보다 크게 출력되어 본문 데이터가 Server에 정상 전달되었음을 확인할 수 있다.</w:t>
       </w:r>
     </w:p>
     <w:p>
@@ -2754,7 +2715,7 @@
           <w:b w:val="0"/>
           <w:sz w:val="21"/>
         </w:rPr>
-        <w:t>마지막에는 Wireshark에서 lo0, tcp.port == 8080 필터를 적용한 화면을 보여준다.</w:t>
+        <w:t>각 요청 처리 후 Server는 Response status를 출력한다. 예를 들어 GET 성공은 HTTP/1.1 200 OK, POST 생성은 HTTP/1.1 201 Created, PUT 성공은 HTTP/1.1 204 No Content, 잘못된 Method는 HTTP/1.1 400 Bad Request로 출력된다.</w:t>
       </w:r>
     </w:p>
     <w:p>
@@ -2767,46 +2728,7 @@
           <w:b w:val="0"/>
           <w:sz w:val="21"/>
         </w:rPr>
-        <w:t>5분이 부족하면 server.py의 함수별 역할과 HTTP 메시지 구조를 설명한다.</w:t>
-      </w:r>
-    </w:p>
-    <w:p>
-      <w:pPr>
-        <w:spacing w:after="100" w:line="276" w:lineRule="auto"/>
-      </w:pPr>
-      <w:r>
-        <w:rPr>
-          <w:rFonts w:ascii="AppleGothic" w:hAnsi="AppleGothic" w:eastAsia="AppleGothic"/>
-          <w:b w:val="0"/>
-          <w:sz w:val="21"/>
-        </w:rPr>
-        <w:t>PUT /put.txt는 204 No Content라 Body가 안 나오는 것이 정상이다. 바로 이어서 GET /put.txt로 변경된 파일 내용을 확인한다.</w:t>
-      </w:r>
-    </w:p>
-    <w:p>
-      <w:pPr>
-        <w:spacing w:after="100" w:line="276" w:lineRule="auto"/>
-      </w:pPr>
-      <w:r>
-        <w:rPr>
-          <w:rFonts w:ascii="AppleGothic" w:hAnsi="AppleGothic" w:eastAsia="AppleGothic"/>
-          <w:b w:val="0"/>
-          <w:sz w:val="21"/>
-        </w:rPr>
-        <w:t>POST /post.txt는 첫 번째 실행에서 파일 생성, 두 번째 실행에서 append가 되는 것을 GET /post.txt로 확인한다.</w:t>
-      </w:r>
-    </w:p>
-    <w:p>
-      <w:pPr>
-        <w:spacing w:after="100" w:line="276" w:lineRule="auto"/>
-      </w:pPr>
-      <w:r>
-        <w:rPr>
-          <w:rFonts w:ascii="AppleGothic" w:hAnsi="AppleGothic" w:eastAsia="AppleGothic"/>
-          <w:b w:val="0"/>
-          <w:sz w:val="21"/>
-        </w:rPr>
-        <w:t>Wireshark 캡처 화면에서는 상단 필터, Protocol HTTP, Info 열의 Method/Status, 하단 상세 영역의 Request Line 또는 Status Line이 보이게 한다.</w:t>
+        <w:t>Server 결과 화면은 README/SERVER_RESULT.png로 저장하여 Client/Wireshark 결과와 함께 제출 자료에 포함할 수 있다.</w:t>
       </w:r>
     </w:p>
     <w:p>
@@ -2825,7 +2747,7 @@
           <w:color w:val="1F4E79"/>
           <w:sz w:val="30"/>
         </w:rPr>
-        <w:t>19. 문제 해결 및 주의 사항</w:t>
+        <w:t>19. 제출 파일 및 캡처 파일 구성</w:t>
       </w:r>
     </w:p>
     <w:p>
@@ -2838,7 +2760,7 @@
           <w:b w:val="0"/>
           <w:sz w:val="21"/>
         </w:rPr>
-        <w:t>포트 8080이 이미 사용 중이면 기존 서버를 종료한 뒤 다시 실행한다.</w:t>
+        <w:t>소스 파일은 server.py와 client.py이다. index.html은 GET 및 HEAD 성공 응답을 검증하기 위한 테스트 파일이다.</w:t>
       </w:r>
     </w:p>
     <w:p>
@@ -2851,7 +2773,7 @@
           <w:b w:val="0"/>
           <w:sz w:val="21"/>
         </w:rPr>
-        <w:t>Client 연결 실패가 발생하면 Server를 먼저 실행했는지 확인한다.</w:t>
+        <w:t>상세 보고서는 README.docx와 README.pdf로 제공한다. 두 파일은 GitHub 기본 README보다 자세한 코드 설명, 환경, 실행 결과 설명을 포함한다.</w:t>
       </w:r>
     </w:p>
     <w:p>
@@ -2864,7 +2786,7 @@
           <w:b w:val="0"/>
           <w:sz w:val="21"/>
         </w:rPr>
-        <w:t>PUT의 204 No Content는 정상 성공 응답이다. 반드시 GET /put.txt로 변경 결과를 추가 확인한다.</w:t>
+        <w:t>README 폴더에는 실행 결과 PNG 이미지를 저장한다. 예: GET_OK.png, GET_NO.png, HEAD.png, POST_1.png, POST_2.png, PUT_OK.png, DELETE.png, BAD_REQUEST.png, SERVER_RESULT.png</w:t>
       </w:r>
     </w:p>
     <w:p>
@@ -2877,7 +2799,20 @@
           <w:b w:val="0"/>
           <w:sz w:val="21"/>
         </w:rPr>
-        <w:t>Wireshark에서 패킷이 보이지 않으면 lo0 인터페이스를 선택했는지 확인한다.</w:t>
+        <w:t>WireShark 폴더에는 Wireshark에서 저장한 원본 pcapng 파일을 저장한다. 예: GET_OK.pcapng, GET_NO.pcapng, HEAD.pcapng, POST_1.pcapng, POST_2.pcapng, PUT.pcapng, DELETE.pcapng, BAD_REQUEST.pcapng</w:t>
+      </w:r>
+    </w:p>
+    <w:p>
+      <w:pPr>
+        <w:spacing w:after="100" w:line="276" w:lineRule="auto"/>
+      </w:pPr>
+      <w:r>
+        <w:rPr>
+          <w:rFonts w:ascii="AppleGothic" w:hAnsi="AppleGothic" w:eastAsia="AppleGothic"/>
+          <w:b w:val="0"/>
+          <w:sz w:val="21"/>
+        </w:rPr>
+        <w:t>실행 중 생성되는 post.txt, put.txt, __pycache__ 등은 결과 파일이므로 GitHub에는 포함하지 않도록 .gitignore에서 제외한다.</w:t>
       </w:r>
     </w:p>
     <w:p>
@@ -2891,7 +2826,7 @@
           <w:color w:val="1F4E79"/>
           <w:sz w:val="30"/>
         </w:rPr>
-        <w:t>20. 전체 결과 요약</w:t>
+        <w:t>20. 전체 실행 결과 요약</w:t>
       </w:r>
     </w:p>
     <w:p>
@@ -2917,7 +2852,7 @@
           <w:b w:val="0"/>
           <w:sz w:val="21"/>
         </w:rPr>
-        <w:t>Server는 GET, HEAD, POST, PUT, DELETE, 잘못된 Method를 처리하며, 파일 조회, 생성, append, 덮어쓰기, 삭제 기능을 수행한다.</w:t>
+        <w:t>Server는 GET, HEAD, POST, PUT, DELETE, 잘못된 Method를 처리하며 파일 조회, 생성, append, 덮어쓰기, 삭제 기능을 수행한다.</w:t>
       </w:r>
     </w:p>
     <w:p>
@@ -2943,7 +2878,20 @@
           <w:b w:val="0"/>
           <w:sz w:val="21"/>
         </w:rPr>
-        <w:t>Wireshark로 HTTP format 캡처가 가능하며, 영상 시연에서는 백엔드 처리와 파일 제어 결과를 중심으로 설명할 수 있다.</w:t>
+        <w:t>Wireshark 캡처를 통해 TCP 연결, HTTP Request, HTTP Response가 실제 패킷으로 교환되는 것을 확인할 수 있다.</w:t>
+      </w:r>
+    </w:p>
+    <w:p>
+      <w:pPr>
+        <w:spacing w:after="100" w:line="276" w:lineRule="auto"/>
+      </w:pPr>
+      <w:r>
+        <w:rPr>
+          <w:rFonts w:ascii="AppleGothic" w:hAnsi="AppleGothic" w:eastAsia="AppleGothic"/>
+          <w:b w:val="0"/>
+          <w:sz w:val="21"/>
+        </w:rPr>
+        <w:t>총 11개의 Method-Response case를 구현하여 과제에서 요구한 5개 이상의 case 조건을 충족한다.</w:t>
       </w:r>
     </w:p>
     <w:sectPr>

</xml_diff>